<commit_message>
feat: add embeddings and retrieval (Phase 3) - Bedrock Titan + JSON vector store
</commit_message>
<xml_diff>
--- a/Clinical_AI_Observationss.docx
+++ b/Clinical_AI_Observationss.docx
@@ -8,7 +8,7 @@
           <w:noProof/>
         </w:rPr>
         <w:drawing>
-          <wp:inline distT="0" distB="0" distL="0" distR="0" wp14:anchorId="094EC432" wp14:editId="1424B267">
+          <wp:inline distT="0" distB="0" distL="0" distR="0" wp14:anchorId="094EC432" wp14:editId="5FCFA4DF">
             <wp:extent cx="5731510" cy="2888615"/>
             <wp:effectExtent l="0" t="0" r="2540" b="6985"/>
             <wp:docPr id="964494272" name="Picture 1"/>
@@ -477,7 +477,7 @@
           <w:noProof/>
         </w:rPr>
         <w:drawing>
-          <wp:inline distT="0" distB="0" distL="0" distR="0" wp14:anchorId="05E38E2E" wp14:editId="616E2218">
+          <wp:inline distT="0" distB="0" distL="0" distR="0" wp14:anchorId="05E38E2E" wp14:editId="76276160">
             <wp:extent cx="5731510" cy="1503680"/>
             <wp:effectExtent l="0" t="0" r="2540" b="1270"/>
             <wp:docPr id="1489028357" name="Picture 6"/>
@@ -687,6 +687,119 @@
                     <a:xfrm>
                       <a:off x="0" y="0"/>
                       <a:ext cx="5731510" cy="4145280"/>
+                    </a:xfrm>
+                    <a:prstGeom prst="rect">
+                      <a:avLst/>
+                    </a:prstGeom>
+                    <a:noFill/>
+                    <a:ln>
+                      <a:noFill/>
+                    </a:ln>
+                  </pic:spPr>
+                </pic:pic>
+              </a:graphicData>
+            </a:graphic>
+          </wp:inline>
+        </w:drawing>
+      </w:r>
+    </w:p>
+    <w:p/>
+    <w:p>
+      <w:r>
+        <w:rPr>
+          <w:noProof/>
+        </w:rPr>
+        <w:drawing>
+          <wp:inline distT="0" distB="0" distL="0" distR="0" wp14:anchorId="5DB41A57" wp14:editId="72B3C8B3">
+            <wp:extent cx="5731510" cy="2825750"/>
+            <wp:effectExtent l="0" t="0" r="2540" b="0"/>
+            <wp:docPr id="1327362419" name="Picture 1"/>
+            <wp:cNvGraphicFramePr>
+              <a:graphicFrameLocks xmlns:a="http://schemas.openxmlformats.org/drawingml/2006/main" noChangeAspect="1"/>
+            </wp:cNvGraphicFramePr>
+            <a:graphic xmlns:a="http://schemas.openxmlformats.org/drawingml/2006/main">
+              <a:graphicData uri="http://schemas.openxmlformats.org/drawingml/2006/picture">
+                <pic:pic xmlns:pic="http://schemas.openxmlformats.org/drawingml/2006/picture">
+                  <pic:nvPicPr>
+                    <pic:cNvPr id="0" name="Picture 1"/>
+                    <pic:cNvPicPr>
+                      <a:picLocks noChangeAspect="1" noChangeArrowheads="1"/>
+                    </pic:cNvPicPr>
+                  </pic:nvPicPr>
+                  <pic:blipFill>
+                    <a:blip r:embed="rId14">
+                      <a:extLst>
+                        <a:ext uri="{28A0092B-C50C-407E-A947-70E740481C1C}">
+                          <a14:useLocalDpi xmlns:a14="http://schemas.microsoft.com/office/drawing/2010/main" val="0"/>
+                        </a:ext>
+                      </a:extLst>
+                    </a:blip>
+                    <a:srcRect/>
+                    <a:stretch>
+                      <a:fillRect/>
+                    </a:stretch>
+                  </pic:blipFill>
+                  <pic:spPr bwMode="auto">
+                    <a:xfrm>
+                      <a:off x="0" y="0"/>
+                      <a:ext cx="5731510" cy="2825750"/>
+                    </a:xfrm>
+                    <a:prstGeom prst="rect">
+                      <a:avLst/>
+                    </a:prstGeom>
+                    <a:noFill/>
+                    <a:ln>
+                      <a:noFill/>
+                    </a:ln>
+                  </pic:spPr>
+                </pic:pic>
+              </a:graphicData>
+            </a:graphic>
+          </wp:inline>
+        </w:drawing>
+      </w:r>
+    </w:p>
+    <w:p/>
+    <w:p>
+      <w:r>
+        <w:rPr>
+          <w:noProof/>
+        </w:rPr>
+        <w:lastRenderedPageBreak/>
+        <w:drawing>
+          <wp:inline distT="0" distB="0" distL="0" distR="0" wp14:anchorId="03CDF19E" wp14:editId="78875DE9">
+            <wp:extent cx="5731510" cy="3266440"/>
+            <wp:effectExtent l="0" t="0" r="2540" b="0"/>
+            <wp:docPr id="1207507352" name="Picture 2"/>
+            <wp:cNvGraphicFramePr>
+              <a:graphicFrameLocks xmlns:a="http://schemas.openxmlformats.org/drawingml/2006/main" noChangeAspect="1"/>
+            </wp:cNvGraphicFramePr>
+            <a:graphic xmlns:a="http://schemas.openxmlformats.org/drawingml/2006/main">
+              <a:graphicData uri="http://schemas.openxmlformats.org/drawingml/2006/picture">
+                <pic:pic xmlns:pic="http://schemas.openxmlformats.org/drawingml/2006/picture">
+                  <pic:nvPicPr>
+                    <pic:cNvPr id="0" name="Picture 2"/>
+                    <pic:cNvPicPr>
+                      <a:picLocks noChangeAspect="1" noChangeArrowheads="1"/>
+                    </pic:cNvPicPr>
+                  </pic:nvPicPr>
+                  <pic:blipFill>
+                    <a:blip r:embed="rId15">
+                      <a:extLst>
+                        <a:ext uri="{28A0092B-C50C-407E-A947-70E740481C1C}">
+                          <a14:useLocalDpi xmlns:a14="http://schemas.microsoft.com/office/drawing/2010/main" val="0"/>
+                        </a:ext>
+                      </a:extLst>
+                    </a:blip>
+                    <a:srcRect/>
+                    <a:stretch>
+                      <a:fillRect/>
+                    </a:stretch>
+                  </pic:blipFill>
+                  <pic:spPr bwMode="auto">
+                    <a:xfrm>
+                      <a:off x="0" y="0"/>
+                      <a:ext cx="5731510" cy="3266440"/>
                     </a:xfrm>
                     <a:prstGeom prst="rect">
                       <a:avLst/>

</xml_diff>